<commit_message>
PC -> lap: Interaccio´n
</commit_message>
<xml_diff>
--- a/TAREAS 6 SEMESTRE/Interacción Humano Computadora/QuijasContrerasVictorManuel011020263P#9.docx
+++ b/TAREAS 6 SEMESTRE/Interacción Humano Computadora/QuijasContrerasVictorManuel011020263P#9.docx
@@ -579,7 +579,7 @@
               </wp:anchor>
             </w:drawing>
           </mc:Choice>
-          <mc:Fallback xmlns:w16cei="http://schemas.microsoft.com/office/word/2026/wordml/cei">
+          <mc:Fallback>
             <w:pict>
               <v:shape w14:anchorId="5D1D070E" id="Cuadro de texto 282" o:spid="_x0000_s1027" type="#_x0000_t202" style="position:absolute;left:0;text-align:left;margin-left:140pt;margin-top:1.55pt;width:314.25pt;height:31.75pt;z-index:251659776;visibility:visible;mso-wrap-style:square;mso-width-percent:0;mso-height-percent:0;mso-wrap-distance-left:9pt;mso-wrap-distance-top:0;mso-wrap-distance-right:9pt;mso-wrap-distance-bottom:0;mso-position-horizontal:absolute;mso-position-horizontal-relative:page;mso-position-vertical:absolute;mso-position-vertical-relative:text;mso-width-percent:0;mso-height-percent:0;mso-width-relative:margin;mso-height-relative:margin;v-text-anchor:top" o:gfxdata="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" filled="f" stroked="f" strokeweight=".5pt">
                 <v:textbox>
@@ -1969,8 +1969,372 @@
     </w:p>
     <w:p>
       <w:pPr>
-        <w:spacing w:line="240" w:lineRule="auto"/>
-      </w:pPr>
+        <w:pStyle w:val="Ttulo2"/>
+      </w:pPr>
+      <w:r>
+        <w:t>Vista</w:t>
+      </w:r>
+    </w:p>
+    <w:p>
+      <w:r>
+        <w:tab/>
+        <w:t>Dentro del archivo “</w:t>
+      </w:r>
+      <w:r>
+        <w:tab/>
+        <w:t xml:space="preserve">activity_list.xml” se encuentra el </w:t>
+      </w:r>
+      <w:r>
+        <w:t xml:space="preserve">elemento de lista </w:t>
+      </w:r>
+      <w:r>
+        <w:t xml:space="preserve">que dentro de la vista </w:t>
+      </w:r>
+      <w:r>
+        <w:t>muestra los valores predeterminados y un pequeño ejemplo de las cosas que puede almacenar. El único atributo que se le asigna es el id.</w:t>
+      </w:r>
+    </w:p>
+    <w:p>
+      <w:pPr>
+        <w:keepNext/>
+      </w:pPr>
+      <w:r>
+        <w:rPr>
+          <w:noProof/>
+        </w:rPr>
+        <w:lastRenderedPageBreak/>
+        <w:drawing>
+          <wp:anchor distT="0" distB="0" distL="114300" distR="114300" simplePos="0" relativeHeight="251684352" behindDoc="0" locked="0" layoutInCell="1" allowOverlap="1" wp14:anchorId="1FD48DAC" wp14:editId="22B250F1">
+            <wp:simplePos x="0" y="0"/>
+            <wp:positionH relativeFrom="page">
+              <wp:align>center</wp:align>
+            </wp:positionH>
+            <wp:positionV relativeFrom="margin">
+              <wp:align>top</wp:align>
+            </wp:positionV>
+            <wp:extent cx="3181350" cy="5372100"/>
+            <wp:effectExtent l="0" t="0" r="0" b="0"/>
+            <wp:wrapTopAndBottom/>
+            <wp:docPr id="1788201964" name="Imagen 7"/>
+            <wp:cNvGraphicFramePr>
+              <a:graphicFrameLocks xmlns:a="http://schemas.openxmlformats.org/drawingml/2006/main" noChangeAspect="1"/>
+            </wp:cNvGraphicFramePr>
+            <a:graphic xmlns:a="http://schemas.openxmlformats.org/drawingml/2006/main">
+              <a:graphicData uri="http://schemas.openxmlformats.org/drawingml/2006/picture">
+                <pic:pic xmlns:pic="http://schemas.openxmlformats.org/drawingml/2006/picture">
+                  <pic:nvPicPr>
+                    <pic:cNvPr id="0" name="Picture 1"/>
+                    <pic:cNvPicPr>
+                      <a:picLocks noChangeAspect="1" noChangeArrowheads="1"/>
+                    </pic:cNvPicPr>
+                  </pic:nvPicPr>
+                  <pic:blipFill>
+                    <a:blip r:embed="rId12">
+                      <a:extLst>
+                        <a:ext uri="{28A0092B-C50C-407E-A947-70E740481C1C}">
+                          <a14:useLocalDpi xmlns:a14="http://schemas.microsoft.com/office/drawing/2010/main" val="0"/>
+                        </a:ext>
+                      </a:extLst>
+                    </a:blip>
+                    <a:srcRect/>
+                    <a:stretch>
+                      <a:fillRect/>
+                    </a:stretch>
+                  </pic:blipFill>
+                  <pic:spPr bwMode="auto">
+                    <a:xfrm>
+                      <a:off x="0" y="0"/>
+                      <a:ext cx="3181350" cy="5372100"/>
+                    </a:xfrm>
+                    <a:prstGeom prst="rect">
+                      <a:avLst/>
+                    </a:prstGeom>
+                    <a:noFill/>
+                    <a:ln>
+                      <a:noFill/>
+                    </a:ln>
+                  </pic:spPr>
+                </pic:pic>
+              </a:graphicData>
+            </a:graphic>
+            <wp14:sizeRelH relativeFrom="page">
+              <wp14:pctWidth>0</wp14:pctWidth>
+            </wp14:sizeRelH>
+            <wp14:sizeRelV relativeFrom="page">
+              <wp14:pctHeight>0</wp14:pctHeight>
+            </wp14:sizeRelV>
+          </wp:anchor>
+        </w:drawing>
+      </w:r>
+    </w:p>
+    <w:p>
+      <w:pPr>
+        <w:pStyle w:val="Descripcin"/>
+      </w:pPr>
+      <w:r>
+        <w:t xml:space="preserve">Ilustración </w:t>
+      </w:r>
+      <w:fldSimple w:instr=" SEQ Ilustración \* ARABIC ">
+        <w:r>
+          <w:rPr>
+            <w:noProof/>
+          </w:rPr>
+          <w:t>1</w:t>
+        </w:r>
+      </w:fldSimple>
+      <w:r>
+        <w:t>. Contenedor de la vista con sus valores predeterminados. Origen: Imagen propia. Vista - list_Activity.xml</w:t>
+      </w:r>
+    </w:p>
+    <w:p>
+      <w:pPr>
+        <w:pStyle w:val="Ttulo2"/>
+      </w:pPr>
+      <w:r>
+        <w:t>Clase</w:t>
+      </w:r>
+    </w:p>
+    <w:p>
+      <w:r>
+        <w:tab/>
+        <w:t xml:space="preserve">Dentro de la clase se asignó dos propiedades importantes al </w:t>
+      </w:r>
+      <w:proofErr w:type="spellStart"/>
+      <w:r>
+        <w:rPr>
+          <w:i/>
+          <w:iCs/>
+        </w:rPr>
+        <w:t>ListView</w:t>
+      </w:r>
+      <w:proofErr w:type="spellEnd"/>
+      <w:r>
+        <w:rPr>
+          <w:i/>
+          <w:iCs/>
+        </w:rPr>
+        <w:t xml:space="preserve">, </w:t>
+      </w:r>
+      <w:r>
+        <w:t xml:space="preserve">un adaptador de la lista de elementos y una función a la espera de una interacción del usuario. El adaptador es el intermediario entre una lista normal y el </w:t>
+      </w:r>
+      <w:proofErr w:type="spellStart"/>
+      <w:r>
+        <w:rPr>
+          <w:i/>
+          <w:iCs/>
+        </w:rPr>
+        <w:t>ListView</w:t>
+      </w:r>
+      <w:proofErr w:type="spellEnd"/>
+      <w:r>
+        <w:rPr>
+          <w:i/>
+          <w:iCs/>
+        </w:rPr>
+        <w:t xml:space="preserve">, </w:t>
+      </w:r>
+      <w:r>
+        <w:t>prepara el contenido de la lista para ser procesado por el contenedor. Para este proyecto se utilizó una lista simple de cadenas de caracteres</w:t>
+      </w:r>
+      <w:r>
+        <w:t xml:space="preserve">, contiene nombres de personajes del videojuego </w:t>
+      </w:r>
+      <w:proofErr w:type="spellStart"/>
+      <w:r>
+        <w:rPr>
+          <w:i/>
+          <w:iCs/>
+        </w:rPr>
+        <w:t>Deltarune</w:t>
+      </w:r>
+      <w:proofErr w:type="spellEnd"/>
+      <w:r>
+        <w:t>. Para poder ingresar la lista de nombres a el contenedor se creó una lista ligada “</w:t>
+      </w:r>
+      <w:proofErr w:type="spellStart"/>
+      <w:r>
+        <w:rPr>
+          <w:i/>
+          <w:iCs/>
+        </w:rPr>
+        <w:t>ArrayList</w:t>
+      </w:r>
+      <w:proofErr w:type="spellEnd"/>
+      <w:r>
+        <w:t xml:space="preserve">”, una clase que se encarga de crear listas dinámicas. La lista se </w:t>
+      </w:r>
+      <w:proofErr w:type="spellStart"/>
+      <w:r>
+        <w:rPr>
+          <w:i/>
+          <w:iCs/>
+        </w:rPr>
+        <w:t>names</w:t>
+      </w:r>
+      <w:proofErr w:type="spellEnd"/>
+      <w:r>
+        <w:t xml:space="preserve"> y se agregan con el método </w:t>
+      </w:r>
+      <w:proofErr w:type="spellStart"/>
+      <w:r>
+        <w:rPr>
+          <w:i/>
+          <w:iCs/>
+        </w:rPr>
+        <w:t>add</w:t>
+      </w:r>
+      <w:proofErr w:type="spellEnd"/>
+      <w:r>
+        <w:rPr>
+          <w:i/>
+          <w:iCs/>
+        </w:rPr>
+        <w:t xml:space="preserve">. </w:t>
+      </w:r>
+      <w:r>
+        <w:t xml:space="preserve">Para podérselo agregar </w:t>
+      </w:r>
+      <w:proofErr w:type="gramStart"/>
+      <w:r>
+        <w:t xml:space="preserve">al  </w:t>
+      </w:r>
+      <w:proofErr w:type="spellStart"/>
+      <w:r>
+        <w:t>ListView</w:t>
+      </w:r>
+      <w:proofErr w:type="spellEnd"/>
+      <w:proofErr w:type="gramEnd"/>
+      <w:r>
+        <w:t xml:space="preserve"> se </w:t>
+      </w:r>
+      <w:r>
+        <w:t>pasó la lista a un adaptador y después el adaptador al contenedor.</w:t>
+      </w:r>
+    </w:p>
+    <w:p>
+      <w:r>
+        <w:lastRenderedPageBreak/>
+        <w:t>//Poner el segundo método (</w:t>
+      </w:r>
+      <w:proofErr w:type="spellStart"/>
+      <w:r>
+        <w:t>OnClick</w:t>
+      </w:r>
+      <w:proofErr w:type="spellEnd"/>
+      <w:r>
+        <w:t>)</w:t>
+      </w:r>
+    </w:p>
+    <w:p>
+      <w:r>
+        <w:rPr>
+          <w:noProof/>
+        </w:rPr>
+        <w:drawing>
+          <wp:inline distT="0" distB="0" distL="0" distR="0" wp14:anchorId="4454E4F2" wp14:editId="450940DB">
+            <wp:extent cx="5791200" cy="4876800"/>
+            <wp:effectExtent l="0" t="0" r="0" b="0"/>
+            <wp:docPr id="1141853868" name="Imagen 9"/>
+            <wp:cNvGraphicFramePr>
+              <a:graphicFrameLocks xmlns:a="http://schemas.openxmlformats.org/drawingml/2006/main" noChangeAspect="1"/>
+            </wp:cNvGraphicFramePr>
+            <a:graphic xmlns:a="http://schemas.openxmlformats.org/drawingml/2006/main">
+              <a:graphicData uri="http://schemas.openxmlformats.org/drawingml/2006/picture">
+                <pic:pic xmlns:pic="http://schemas.openxmlformats.org/drawingml/2006/picture">
+                  <pic:nvPicPr>
+                    <pic:cNvPr id="0" name="Picture 3"/>
+                    <pic:cNvPicPr>
+                      <a:picLocks noChangeAspect="1" noChangeArrowheads="1"/>
+                    </pic:cNvPicPr>
+                  </pic:nvPicPr>
+                  <pic:blipFill>
+                    <a:blip r:embed="rId13">
+                      <a:extLst>
+                        <a:ext uri="{28A0092B-C50C-407E-A947-70E740481C1C}">
+                          <a14:useLocalDpi xmlns:a14="http://schemas.microsoft.com/office/drawing/2010/main" val="0"/>
+                        </a:ext>
+                      </a:extLst>
+                    </a:blip>
+                    <a:srcRect/>
+                    <a:stretch>
+                      <a:fillRect/>
+                    </a:stretch>
+                  </pic:blipFill>
+                  <pic:spPr bwMode="auto">
+                    <a:xfrm>
+                      <a:off x="0" y="0"/>
+                      <a:ext cx="5791200" cy="4876800"/>
+                    </a:xfrm>
+                    <a:prstGeom prst="rect">
+                      <a:avLst/>
+                    </a:prstGeom>
+                    <a:noFill/>
+                    <a:ln>
+                      <a:noFill/>
+                    </a:ln>
+                  </pic:spPr>
+                </pic:pic>
+              </a:graphicData>
+            </a:graphic>
+          </wp:inline>
+        </w:drawing>
+      </w:r>
+    </w:p>
+    <w:p>
+      <w:r>
+        <w:rPr>
+          <w:noProof/>
+        </w:rPr>
+        <w:drawing>
+          <wp:inline distT="0" distB="0" distL="0" distR="0" wp14:anchorId="5D8C326B" wp14:editId="5EB967AF">
+            <wp:extent cx="5791200" cy="1990725"/>
+            <wp:effectExtent l="0" t="0" r="0" b="9525"/>
+            <wp:docPr id="812931480" name="Imagen 8"/>
+            <wp:cNvGraphicFramePr>
+              <a:graphicFrameLocks xmlns:a="http://schemas.openxmlformats.org/drawingml/2006/main" noChangeAspect="1"/>
+            </wp:cNvGraphicFramePr>
+            <a:graphic xmlns:a="http://schemas.openxmlformats.org/drawingml/2006/main">
+              <a:graphicData uri="http://schemas.openxmlformats.org/drawingml/2006/picture">
+                <pic:pic xmlns:pic="http://schemas.openxmlformats.org/drawingml/2006/picture">
+                  <pic:nvPicPr>
+                    <pic:cNvPr id="0" name="Picture 2"/>
+                    <pic:cNvPicPr>
+                      <a:picLocks noChangeAspect="1" noChangeArrowheads="1"/>
+                    </pic:cNvPicPr>
+                  </pic:nvPicPr>
+                  <pic:blipFill>
+                    <a:blip r:embed="rId14">
+                      <a:extLst>
+                        <a:ext uri="{28A0092B-C50C-407E-A947-70E740481C1C}">
+                          <a14:useLocalDpi xmlns:a14="http://schemas.microsoft.com/office/drawing/2010/main" val="0"/>
+                        </a:ext>
+                      </a:extLst>
+                    </a:blip>
+                    <a:srcRect/>
+                    <a:stretch>
+                      <a:fillRect/>
+                    </a:stretch>
+                  </pic:blipFill>
+                  <pic:spPr bwMode="auto">
+                    <a:xfrm>
+                      <a:off x="0" y="0"/>
+                      <a:ext cx="5791200" cy="1990725"/>
+                    </a:xfrm>
+                    <a:prstGeom prst="rect">
+                      <a:avLst/>
+                    </a:prstGeom>
+                    <a:noFill/>
+                    <a:ln>
+                      <a:noFill/>
+                    </a:ln>
+                  </pic:spPr>
+                </pic:pic>
+              </a:graphicData>
+            </a:graphic>
+          </wp:inline>
+        </w:drawing>
+      </w:r>
     </w:p>
     <w:p>
       <w:pPr>
@@ -1992,41 +2356,6 @@
     </w:p>
     <w:p/>
     <w:p/>
-    <w:p>
-      <w:pPr>
-        <w:jc w:val="left"/>
-      </w:pPr>
-      <w:r>
-        <w:t xml:space="preserve">Nombre del archivo: </w:t>
-      </w:r>
-      <w:r>
-        <w:br/>
-      </w:r>
-      <w:proofErr w:type="spellStart"/>
-      <w:proofErr w:type="gramStart"/>
-      <w:r>
-        <w:t>QuijasContrerasVictorManuel</w:t>
-      </w:r>
-      <w:proofErr w:type="spellEnd"/>
-      <w:r>
-        <w:t>[</w:t>
-      </w:r>
-      <w:proofErr w:type="gramEnd"/>
-      <w:r>
-        <w:t>Fecha</w:t>
-      </w:r>
-      <w:proofErr w:type="gramStart"/>
-      <w:r>
-        <w:t>][</w:t>
-      </w:r>
-      <w:proofErr w:type="gramEnd"/>
-      <w:r>
-        <w:t>Tipo de actividad]#[número].</w:t>
-      </w:r>
-    </w:p>
-    <w:p/>
-    <w:p/>
-    <w:p/>
     <w:p/>
     <w:p/>
     <w:p/>
@@ -2035,10 +2364,10 @@
     <w:p/>
     <w:p/>
     <w:sectPr>
-      <w:headerReference w:type="even" r:id="rId12"/>
-      <w:headerReference w:type="default" r:id="rId13"/>
-      <w:footerReference w:type="even" r:id="rId14"/>
-      <w:footerReference w:type="default" r:id="rId15"/>
+      <w:headerReference w:type="even" r:id="rId15"/>
+      <w:headerReference w:type="default" r:id="rId16"/>
+      <w:footerReference w:type="even" r:id="rId17"/>
+      <w:footerReference w:type="default" r:id="rId18"/>
       <w:pgSz w:w="12240" w:h="15840"/>
       <w:pgMar w:top="1418" w:right="1134" w:bottom="1418" w:left="1701" w:header="720" w:footer="720" w:gutter="284"/>
       <w:pgBorders w:offsetFrom="page">

</xml_diff>

<commit_message>
PC -> lap: Bajo nivel
</commit_message>
<xml_diff>
--- a/TAREAS 6 SEMESTRE/Interacción Humano Computadora/QuijasContrerasVictorManuel011020263P#9.docx
+++ b/TAREAS 6 SEMESTRE/Interacción Humano Computadora/QuijasContrerasVictorManuel011020263P#9.docx
@@ -299,16 +299,16 @@
                               <w:jc w:val="center"/>
                               <w:rPr>
                                 <w:rFonts w:ascii="Book Antiqua" w:hAnsi="Book Antiqua"/>
-                                <w:sz w:val="180"/>
-                                <w:szCs w:val="200"/>
+                                <w:sz w:val="200"/>
+                                <w:szCs w:val="220"/>
                               </w:rPr>
                             </w:pPr>
                             <w:proofErr w:type="spellStart"/>
                             <w:r>
                               <w:rPr>
                                 <w:rFonts w:ascii="Book Antiqua" w:hAnsi="Book Antiqua"/>
-                                <w:sz w:val="72"/>
-                                <w:szCs w:val="96"/>
+                                <w:sz w:val="96"/>
+                                <w:szCs w:val="144"/>
                               </w:rPr>
                               <w:t>ListView</w:t>
                             </w:r>
@@ -348,16 +348,16 @@
                         <w:jc w:val="center"/>
                         <w:rPr>
                           <w:rFonts w:ascii="Book Antiqua" w:hAnsi="Book Antiqua"/>
-                          <w:sz w:val="180"/>
-                          <w:szCs w:val="200"/>
+                          <w:sz w:val="200"/>
+                          <w:szCs w:val="220"/>
                         </w:rPr>
                       </w:pPr>
                       <w:proofErr w:type="spellStart"/>
                       <w:r>
                         <w:rPr>
                           <w:rFonts w:ascii="Book Antiqua" w:hAnsi="Book Antiqua"/>
-                          <w:sz w:val="72"/>
-                          <w:szCs w:val="96"/>
+                          <w:sz w:val="96"/>
+                          <w:szCs w:val="144"/>
                         </w:rPr>
                         <w:t>ListView</w:t>
                       </w:r>
@@ -1427,21 +1427,21 @@
       <w:sdtContent>
         <w:p>
           <w:pPr>
-            <w:pStyle w:val="Ttulo1"/>
+            <w:pStyle w:val="Heading1"/>
             <w:rPr>
-              <w:rStyle w:val="Ttulo1Car"/>
+              <w:rStyle w:val="Heading1Char"/>
             </w:rPr>
           </w:pPr>
           <w:r>
             <w:rPr>
-              <w:rStyle w:val="Ttulo1Car"/>
+              <w:rStyle w:val="Heading1Char"/>
               <w:lang w:val="es-ES"/>
             </w:rPr>
             <w:t>Í</w:t>
           </w:r>
           <w:r>
             <w:rPr>
-              <w:rStyle w:val="Ttulo1Car"/>
+              <w:rStyle w:val="Heading1Char"/>
               <w:lang w:val="es-ES"/>
             </w:rPr>
             <w:t>ndice</w:t>
@@ -1450,7 +1450,7 @@
         </w:p>
         <w:p>
           <w:pPr>
-            <w:pStyle w:val="TDC1"/>
+            <w:pStyle w:val="TOC1"/>
             <w:tabs>
               <w:tab w:val="right" w:leader="dot" w:pos="9111"/>
             </w:tabs>
@@ -1472,7 +1472,7 @@
           <w:hyperlink w:anchor="_Toc220850609" w:history="1">
             <w:r>
               <w:rPr>
-                <w:rStyle w:val="Hipervnculo"/>
+                <w:rStyle w:val="Hyperlink"/>
                 <w:noProof/>
                 <w:lang w:val="es-ES"/>
               </w:rPr>
@@ -1530,7 +1530,7 @@
         </w:p>
         <w:p>
           <w:pPr>
-            <w:pStyle w:val="TDC1"/>
+            <w:pStyle w:val="TOC1"/>
             <w:tabs>
               <w:tab w:val="right" w:leader="dot" w:pos="9111"/>
             </w:tabs>
@@ -1543,7 +1543,7 @@
           <w:hyperlink w:anchor="_Toc220850610" w:history="1">
             <w:r>
               <w:rPr>
-                <w:rStyle w:val="Hipervnculo"/>
+                <w:rStyle w:val="Hyperlink"/>
                 <w:noProof/>
               </w:rPr>
               <w:t>Tabla de ilustraciones</w:t>
@@ -1600,7 +1600,7 @@
         </w:p>
         <w:p>
           <w:pPr>
-            <w:pStyle w:val="TDC1"/>
+            <w:pStyle w:val="TOC1"/>
             <w:tabs>
               <w:tab w:val="right" w:leader="dot" w:pos="9111"/>
             </w:tabs>
@@ -1613,7 +1613,7 @@
           <w:hyperlink w:anchor="_Toc220850611" w:history="1">
             <w:r>
               <w:rPr>
-                <w:rStyle w:val="Hipervnculo"/>
+                <w:rStyle w:val="Hyperlink"/>
                 <w:noProof/>
               </w:rPr>
               <w:t>Desarrollo</w:t>
@@ -1670,7 +1670,7 @@
         </w:p>
         <w:p>
           <w:pPr>
-            <w:pStyle w:val="TDC1"/>
+            <w:pStyle w:val="TOC1"/>
             <w:tabs>
               <w:tab w:val="right" w:leader="dot" w:pos="9111"/>
             </w:tabs>
@@ -1683,7 +1683,7 @@
           <w:hyperlink w:anchor="_Toc220850612" w:history="1">
             <w:r>
               <w:rPr>
-                <w:rStyle w:val="Hipervnculo"/>
+                <w:rStyle w:val="Hyperlink"/>
                 <w:noProof/>
               </w:rPr>
               <w:t>Conclusión</w:t>
@@ -1740,7 +1740,7 @@
         </w:p>
         <w:p>
           <w:pPr>
-            <w:pStyle w:val="TDC1"/>
+            <w:pStyle w:val="TOC1"/>
             <w:tabs>
               <w:tab w:val="right" w:leader="dot" w:pos="9111"/>
             </w:tabs>
@@ -1753,7 +1753,7 @@
           <w:hyperlink w:anchor="_Toc220850613" w:history="1">
             <w:r>
               <w:rPr>
-                <w:rStyle w:val="Hipervnculo"/>
+                <w:rStyle w:val="Hyperlink"/>
                 <w:noProof/>
               </w:rPr>
               <w:t>Bibliografía</w:t>
@@ -1822,7 +1822,7 @@
     </w:sdt>
     <w:p>
       <w:pPr>
-        <w:pStyle w:val="Ttulo1"/>
+        <w:pStyle w:val="Heading1"/>
       </w:pPr>
       <w:bookmarkStart w:id="1" w:name="_Toc220850610"/>
       <w:r>
@@ -1846,7 +1846,7 @@
     <w:p/>
     <w:p>
       <w:pPr>
-        <w:pStyle w:val="Ttulo1"/>
+        <w:pStyle w:val="Heading1"/>
       </w:pPr>
       <w:r>
         <w:t>Reporte</w:t>
@@ -1903,7 +1903,7 @@
     </w:p>
     <w:p>
       <w:pPr>
-        <w:pStyle w:val="Prrafodelista"/>
+        <w:pStyle w:val="ListParagraph"/>
         <w:numPr>
           <w:ilvl w:val="0"/>
           <w:numId w:val="33"/>
@@ -1924,7 +1924,7 @@
     </w:p>
     <w:p>
       <w:pPr>
-        <w:pStyle w:val="Prrafodelista"/>
+        <w:pStyle w:val="ListParagraph"/>
         <w:numPr>
           <w:ilvl w:val="0"/>
           <w:numId w:val="33"/>
@@ -1937,7 +1937,7 @@
     </w:p>
     <w:p>
       <w:pPr>
-        <w:pStyle w:val="Prrafodelista"/>
+        <w:pStyle w:val="ListParagraph"/>
         <w:numPr>
           <w:ilvl w:val="0"/>
           <w:numId w:val="33"/>
@@ -1953,7 +1953,7 @@
     </w:p>
     <w:p>
       <w:pPr>
-        <w:pStyle w:val="Prrafodelista"/>
+        <w:pStyle w:val="ListParagraph"/>
         <w:numPr>
           <w:ilvl w:val="0"/>
           <w:numId w:val="33"/>
@@ -1969,7 +1969,7 @@
     </w:p>
     <w:p>
       <w:pPr>
-        <w:pStyle w:val="Ttulo2"/>
+        <w:pStyle w:val="Heading2"/>
       </w:pPr>
       <w:r>
         <w:t>Vista</w:t>
@@ -2004,7 +2004,7 @@
         </w:rPr>
         <w:lastRenderedPageBreak/>
         <w:drawing>
-          <wp:anchor distT="0" distB="0" distL="114300" distR="114300" simplePos="0" relativeHeight="251684352" behindDoc="0" locked="0" layoutInCell="1" allowOverlap="1" wp14:anchorId="1FD48DAC" wp14:editId="22B250F1">
+          <wp:anchor distT="0" distB="0" distL="114300" distR="114300" simplePos="0" relativeHeight="251684352" behindDoc="0" locked="0" layoutInCell="1" allowOverlap="1" wp14:anchorId="1FD48DAC" wp14:editId="0D71A640">
             <wp:simplePos x="0" y="0"/>
             <wp:positionH relativeFrom="page">
               <wp:align>center</wp:align>
@@ -2013,7 +2013,7 @@
               <wp:align>top</wp:align>
             </wp:positionV>
             <wp:extent cx="3181350" cy="5372100"/>
-            <wp:effectExtent l="0" t="0" r="0" b="0"/>
+            <wp:effectExtent l="76200" t="76200" r="133350" b="133350"/>
             <wp:wrapTopAndBottom/>
             <wp:docPr id="1788201964" name="Imagen 7"/>
             <wp:cNvGraphicFramePr>
@@ -2049,10 +2049,20 @@
                     <a:prstGeom prst="rect">
                       <a:avLst/>
                     </a:prstGeom>
-                    <a:noFill/>
-                    <a:ln>
-                      <a:noFill/>
+                    <a:ln w="38100" cap="sq">
+                      <a:solidFill>
+                        <a:srgbClr val="000000"/>
+                      </a:solidFill>
+                      <a:prstDash val="solid"/>
+                      <a:miter lim="800000"/>
                     </a:ln>
+                    <a:effectLst>
+                      <a:outerShdw blurRad="50800" dist="38100" dir="2700000" algn="tl" rotWithShape="0">
+                        <a:srgbClr val="000000">
+                          <a:alpha val="43000"/>
+                        </a:srgbClr>
+                      </a:outerShdw>
+                    </a:effectLst>
                   </pic:spPr>
                 </pic:pic>
               </a:graphicData>
@@ -2069,7 +2079,7 @@
     </w:p>
     <w:p>
       <w:pPr>
-        <w:pStyle w:val="Descripcin"/>
+        <w:pStyle w:val="Caption"/>
       </w:pPr>
       <w:r>
         <w:t xml:space="preserve">Ilustración </w:t>
@@ -2088,7 +2098,7 @@
     </w:p>
     <w:p>
       <w:pPr>
-        <w:pStyle w:val="Ttulo2"/>
+        <w:pStyle w:val="Heading2"/>
       </w:pPr>
       <w:r>
         <w:t>Clase</w:t>
@@ -2162,7 +2172,11 @@
       </w:r>
       <w:proofErr w:type="spellEnd"/>
       <w:r>
-        <w:t xml:space="preserve">”, una clase que se encarga de crear listas dinámicas. La lista se </w:t>
+        <w:t xml:space="preserve">”, una clase que se encarga de crear listas dinámicas. La lista </w:t>
+      </w:r>
+      <w:r>
+        <w:lastRenderedPageBreak/>
+        <w:t xml:space="preserve">se </w:t>
       </w:r>
       <w:proofErr w:type="spellStart"/>
       <w:r>
@@ -2195,16 +2209,14 @@
       <w:r>
         <w:t xml:space="preserve">Para podérselo agregar </w:t>
       </w:r>
-      <w:proofErr w:type="gramStart"/>
-      <w:r>
-        <w:t xml:space="preserve">al  </w:t>
+      <w:r>
+        <w:t xml:space="preserve">al </w:t>
       </w:r>
       <w:proofErr w:type="spellStart"/>
       <w:r>
         <w:t>ListView</w:t>
       </w:r>
       <w:proofErr w:type="spellEnd"/>
-      <w:proofErr w:type="gramEnd"/>
       <w:r>
         <w:t xml:space="preserve"> se </w:t>
       </w:r>
@@ -2214,28 +2226,69 @@
     </w:p>
     <w:p>
       <w:r>
-        <w:lastRenderedPageBreak/>
-        <w:t>//Poner el segundo método (</w:t>
+        <w:tab/>
+      </w:r>
+      <w:r>
+        <w:t xml:space="preserve">La segunda propiedad asignada a la lista fue la de </w:t>
+      </w:r>
+      <w:r>
+        <w:t>“</w:t>
       </w:r>
       <w:proofErr w:type="spellStart"/>
       <w:r>
-        <w:t>OnClick</w:t>
+        <w:rPr>
+          <w:i/>
+          <w:iCs/>
+        </w:rPr>
+        <w:t>onItemClick</w:t>
       </w:r>
       <w:proofErr w:type="spellEnd"/>
       <w:r>
-        <w:t>)</w:t>
+        <w:t xml:space="preserve">”, que permite crear funciones dependiendo el </w:t>
+      </w:r>
+      <w:proofErr w:type="spellStart"/>
+      <w:r>
+        <w:t>item</w:t>
+      </w:r>
+      <w:proofErr w:type="spellEnd"/>
+      <w:r>
+        <w:t xml:space="preserve"> de la lista que fue presionado. En esta practica se utilizó que la función mostrara un breve mensaje caracterizado por el personaje que fue presionado. Para agregar esta función al componente </w:t>
+      </w:r>
+      <w:proofErr w:type="spellStart"/>
+      <w:r>
+        <w:rPr>
+          <w:i/>
+          <w:iCs/>
+        </w:rPr>
+        <w:t>ListView</w:t>
+      </w:r>
+      <w:proofErr w:type="spellEnd"/>
+      <w:r>
+        <w:rPr>
+          <w:i/>
+          <w:iCs/>
+        </w:rPr>
+        <w:t xml:space="preserve"> </w:t>
+      </w:r>
+      <w:r>
+        <w:t>fue necesario crear un adaptador nuevo dentro de la definición.</w:t>
       </w:r>
     </w:p>
+    <w:p/>
     <w:p>
+      <w:pPr>
+        <w:keepNext/>
+      </w:pPr>
       <w:r>
         <w:rPr>
           <w:noProof/>
         </w:rPr>
+        <w:lastRenderedPageBreak/>
         <w:drawing>
-          <wp:inline distT="0" distB="0" distL="0" distR="0" wp14:anchorId="4454E4F2" wp14:editId="450940DB">
-            <wp:extent cx="5791200" cy="4876800"/>
-            <wp:effectExtent l="0" t="0" r="0" b="0"/>
-            <wp:docPr id="1141853868" name="Imagen 9"/>
+          <wp:inline distT="0" distB="0" distL="0" distR="0" wp14:anchorId="5D8C326B" wp14:editId="10015504">
+            <wp:extent cx="5791200" cy="1990725"/>
+            <wp:effectExtent l="76200" t="76200" r="133350" b="142875"/>
+            <wp:docPr id="812931480" name="Imagen 8"/>
             <wp:cNvGraphicFramePr>
               <a:graphicFrameLocks xmlns:a="http://schemas.openxmlformats.org/drawingml/2006/main" noChangeAspect="1"/>
             </wp:cNvGraphicFramePr>
@@ -2243,7 +2296,7 @@
               <a:graphicData uri="http://schemas.openxmlformats.org/drawingml/2006/picture">
                 <pic:pic xmlns:pic="http://schemas.openxmlformats.org/drawingml/2006/picture">
                   <pic:nvPicPr>
-                    <pic:cNvPr id="0" name="Picture 3"/>
+                    <pic:cNvPr id="0" name="Picture 2"/>
                     <pic:cNvPicPr>
                       <a:picLocks noChangeAspect="1" noChangeArrowheads="1"/>
                     </pic:cNvPicPr>
@@ -2264,15 +2317,25 @@
                   <pic:spPr bwMode="auto">
                     <a:xfrm>
                       <a:off x="0" y="0"/>
-                      <a:ext cx="5791200" cy="4876800"/>
+                      <a:ext cx="5791200" cy="1990725"/>
                     </a:xfrm>
                     <a:prstGeom prst="rect">
                       <a:avLst/>
                     </a:prstGeom>
-                    <a:noFill/>
-                    <a:ln>
-                      <a:noFill/>
+                    <a:ln w="38100" cap="sq">
+                      <a:solidFill>
+                        <a:srgbClr val="000000"/>
+                      </a:solidFill>
+                      <a:prstDash val="solid"/>
+                      <a:miter lim="800000"/>
                     </a:ln>
+                    <a:effectLst>
+                      <a:outerShdw blurRad="50800" dist="38100" dir="2700000" algn="tl" rotWithShape="0">
+                        <a:srgbClr val="000000">
+                          <a:alpha val="43000"/>
+                        </a:srgbClr>
+                      </a:outerShdw>
+                    </a:effectLst>
                   </pic:spPr>
                 </pic:pic>
               </a:graphicData>
@@ -2280,17 +2343,15 @@
           </wp:inline>
         </w:drawing>
       </w:r>
-    </w:p>
-    <w:p>
       <w:r>
         <w:rPr>
           <w:noProof/>
         </w:rPr>
         <w:drawing>
-          <wp:inline distT="0" distB="0" distL="0" distR="0" wp14:anchorId="5D8C326B" wp14:editId="5EB967AF">
-            <wp:extent cx="5791200" cy="1990725"/>
-            <wp:effectExtent l="0" t="0" r="0" b="9525"/>
-            <wp:docPr id="812931480" name="Imagen 8"/>
+          <wp:inline distT="0" distB="0" distL="0" distR="0" wp14:anchorId="2EEA281D" wp14:editId="5EBE04C8">
+            <wp:extent cx="5791200" cy="4876800"/>
+            <wp:effectExtent l="76200" t="76200" r="133350" b="133350"/>
+            <wp:docPr id="1141853868" name="Imagen 9"/>
             <wp:cNvGraphicFramePr>
               <a:graphicFrameLocks xmlns:a="http://schemas.openxmlformats.org/drawingml/2006/main" noChangeAspect="1"/>
             </wp:cNvGraphicFramePr>
@@ -2298,7 +2359,7 @@
               <a:graphicData uri="http://schemas.openxmlformats.org/drawingml/2006/picture">
                 <pic:pic xmlns:pic="http://schemas.openxmlformats.org/drawingml/2006/picture">
                   <pic:nvPicPr>
-                    <pic:cNvPr id="0" name="Picture 2"/>
+                    <pic:cNvPr id="0" name="Picture 3"/>
                     <pic:cNvPicPr>
                       <a:picLocks noChangeAspect="1" noChangeArrowheads="1"/>
                     </pic:cNvPicPr>
@@ -2319,15 +2380,25 @@
                   <pic:spPr bwMode="auto">
                     <a:xfrm>
                       <a:off x="0" y="0"/>
-                      <a:ext cx="5791200" cy="1990725"/>
+                      <a:ext cx="5791200" cy="4876800"/>
                     </a:xfrm>
                     <a:prstGeom prst="rect">
                       <a:avLst/>
                     </a:prstGeom>
-                    <a:noFill/>
-                    <a:ln>
-                      <a:noFill/>
+                    <a:ln w="38100" cap="sq">
+                      <a:solidFill>
+                        <a:srgbClr val="000000"/>
+                      </a:solidFill>
+                      <a:prstDash val="solid"/>
+                      <a:miter lim="800000"/>
                     </a:ln>
+                    <a:effectLst>
+                      <a:outerShdw blurRad="50800" dist="38100" dir="2700000" algn="tl" rotWithShape="0">
+                        <a:srgbClr val="000000">
+                          <a:alpha val="43000"/>
+                        </a:srgbClr>
+                      </a:outerShdw>
+                    </a:effectLst>
                   </pic:spPr>
                 </pic:pic>
               </a:graphicData>
@@ -2338,23 +2409,85 @@
     </w:p>
     <w:p>
       <w:pPr>
-        <w:pStyle w:val="Ttulo1"/>
+        <w:pStyle w:val="Caption"/>
+      </w:pPr>
+      <w:r>
+        <w:t xml:space="preserve">Ilustración </w:t>
+      </w:r>
+      <w:fldSimple w:instr=" SEQ Ilustración \* ARABIC ">
+        <w:r>
+          <w:rPr>
+            <w:noProof/>
+          </w:rPr>
+          <w:t>2</w:t>
+        </w:r>
+      </w:fldSimple>
+      <w:r>
+        <w:t>. Clase controladora de la vista "</w:t>
+      </w:r>
+      <w:proofErr w:type="spellStart"/>
+      <w:r>
+        <w:t>activity-list</w:t>
+      </w:r>
+      <w:proofErr w:type="spellEnd"/>
+      <w:r>
+        <w:t>". Fuente: elaboración propia.</w:t>
+      </w:r>
+    </w:p>
+    <w:p>
+      <w:pPr>
+        <w:pStyle w:val="Heading1"/>
       </w:pPr>
       <w:bookmarkStart w:id="2" w:name="_Toc220850613"/>
       <w:r>
+        <w:lastRenderedPageBreak/>
         <w:t>Bibliografía</w:t>
       </w:r>
       <w:bookmarkEnd w:id="2"/>
     </w:p>
     <w:p>
-      <w:r>
-        <w:t>Hola soy una bibliografía en formato APA</w:t>
-      </w:r>
-      <w:r>
-        <w:t>6</w:t>
+      <w:pPr>
+        <w:pStyle w:val="ListParagraph"/>
+        <w:numPr>
+          <w:ilvl w:val="0"/>
+          <w:numId w:val="34"/>
+        </w:numPr>
+      </w:pPr>
+      <w:r>
+        <w:rPr>
+          <w:lang w:val="en-US"/>
+        </w:rPr>
+        <w:t xml:space="preserve">Android API reference. (s/f). </w:t>
+      </w:r>
+      <w:r>
+        <w:t xml:space="preserve">Recuperado el </w:t>
+      </w:r>
+      <w:r>
+        <w:t>30</w:t>
+      </w:r>
+      <w:r>
+        <w:t xml:space="preserve"> de septiembre de 2026, de Android </w:t>
+      </w:r>
+      <w:proofErr w:type="spellStart"/>
+      <w:r>
+        <w:t>Developers</w:t>
+      </w:r>
+      <w:proofErr w:type="spellEnd"/>
+      <w:r>
+        <w:t xml:space="preserve"> </w:t>
+      </w:r>
+      <w:proofErr w:type="spellStart"/>
+      <w:r>
+        <w:t>website</w:t>
+      </w:r>
+      <w:proofErr w:type="spellEnd"/>
+      <w:r>
+        <w:t>: https://developer.android.com/reference</w:t>
+      </w:r>
+      <w:r>
+        <w:t>.</w:t>
       </w:r>
     </w:p>
-    <w:p/>
     <w:p/>
     <w:p/>
     <w:p/>
@@ -2430,7 +2563,7 @@
     <w:sdtContent>
       <w:p>
         <w:pPr>
-          <w:pStyle w:val="Piedepgina"/>
+          <w:pStyle w:val="Footer"/>
           <w:jc w:val="center"/>
           <w:rPr>
             <w:rFonts w:asciiTheme="majorHAnsi" w:hAnsiTheme="majorHAnsi" w:cstheme="majorHAnsi"/>
@@ -2496,7 +2629,7 @@
   </w:sdt>
   <w:p>
     <w:pPr>
-      <w:pStyle w:val="Piedepgina"/>
+      <w:pStyle w:val="Footer"/>
     </w:pPr>
   </w:p>
 </w:ftr>
@@ -2506,7 +2639,7 @@
 <w:ftr xmlns:wpc="http://schemas.microsoft.com/office/word/2010/wordprocessingCanvas" xmlns:cx="http://schemas.microsoft.com/office/drawing/2014/chartex" xmlns:cx1="http://schemas.microsoft.com/office/drawing/2015/9/8/chartex" xmlns:cx2="http://schemas.microsoft.com/office/drawing/2015/10/21/chartex" xmlns:cx3="http://schemas.microsoft.com/office/drawing/2016/5/9/chartex" xmlns:cx4="http://schemas.microsoft.com/office/drawing/2016/5/10/chartex" xmlns:cx5="http://schemas.microsoft.com/office/drawing/2016/5/11/chartex" xmlns:cx6="http://schemas.microsoft.com/office/drawing/2016/5/12/chartex" xmlns:cx7="http://schemas.microsoft.com/office/drawing/2016/5/13/chartex" xmlns:cx8="http://schemas.microsoft.com/office/drawing/2016/5/14/chartex" xmlns:mc="http://schemas.openxmlformats.org/markup-compatibility/2006" xmlns:aink="http://schemas.microsoft.com/office/drawing/2016/ink" xmlns:am3d="http://schemas.microsoft.com/office/drawing/2017/model3d" xmlns:o="urn:schemas-microsoft-com:office:office" xmlns:oel="http://schemas.microsoft.com/office/2019/extlst" xmlns:r="http://schemas.openxmlformats.org/officeDocument/2006/relationships" xmlns:m="http://schemas.openxmlformats.org/officeDocument/2006/math" xmlns:v="urn:schemas-microsoft-com:vml" xmlns:wp14="http://schemas.microsoft.com/office/word/2010/wordprocessingDrawing" xmlns:wp="http://schemas.openxmlformats.org/drawingml/2006/wordprocessingDrawing" xmlns:w10="urn:schemas-microsoft-com:office:word" xmlns:w="http://schemas.openxmlformats.org/wordprocessingml/2006/main" xmlns:w14="http://schemas.microsoft.com/office/word/2010/wordml" xmlns:w15="http://schemas.microsoft.com/office/word/2012/wordml" xmlns:w16cex="http://schemas.microsoft.com/office/word/2018/wordml/cex" xmlns:w16cid="http://schemas.microsoft.com/office/word/2016/wordml/cid" xmlns:w16="http://schemas.microsoft.com/office/word/2018/wordml" xmlns:w16du="http://schemas.microsoft.com/office/word/2023/wordml/word16du" xmlns:w16sdtdh="http://schemas.microsoft.com/office/word/2020/wordml/sdtdatahash" xmlns:w16sdtfl="http://schemas.microsoft.com/office/word/2024/wordml/sdtformatlock" xmlns:w16se="http://schemas.microsoft.com/office/word/2015/wordml/symex" xmlns:wpg="http://schemas.microsoft.com/office/word/2010/wordprocessingGroup" xmlns:wpi="http://schemas.microsoft.com/office/word/2010/wordprocessingInk" xmlns:wne="http://schemas.microsoft.com/office/word/2006/wordml" xmlns:wps="http://schemas.microsoft.com/office/word/2010/wordprocessingShape" mc:Ignorable="w14 w15 w16se w16cid w16 w16cex w16sdtdh w16sdtfl w16du wp14">
   <w:p>
     <w:pPr>
-      <w:pStyle w:val="Piedepgina"/>
+      <w:pStyle w:val="Footer"/>
       <w:jc w:val="right"/>
       <w:rPr>
         <w:rFonts w:asciiTheme="majorHAnsi" w:hAnsiTheme="majorHAnsi" w:cstheme="majorHAnsi"/>
@@ -2558,7 +2691,7 @@
 <w:hdr xmlns:wpc="http://schemas.microsoft.com/office/word/2010/wordprocessingCanvas" xmlns:cx="http://schemas.microsoft.com/office/drawing/2014/chartex" xmlns:cx1="http://schemas.microsoft.com/office/drawing/2015/9/8/chartex" xmlns:cx2="http://schemas.microsoft.com/office/drawing/2015/10/21/chartex" xmlns:cx3="http://schemas.microsoft.com/office/drawing/2016/5/9/chartex" xmlns:cx4="http://schemas.microsoft.com/office/drawing/2016/5/10/chartex" xmlns:cx5="http://schemas.microsoft.com/office/drawing/2016/5/11/chartex" xmlns:cx6="http://schemas.microsoft.com/office/drawing/2016/5/12/chartex" xmlns:cx7="http://schemas.microsoft.com/office/drawing/2016/5/13/chartex" xmlns:cx8="http://schemas.microsoft.com/office/drawing/2016/5/14/chartex" xmlns:mc="http://schemas.openxmlformats.org/markup-compatibility/2006" xmlns:aink="http://schemas.microsoft.com/office/drawing/2016/ink" xmlns:am3d="http://schemas.microsoft.com/office/drawing/2017/model3d" xmlns:o="urn:schemas-microsoft-com:office:office" xmlns:oel="http://schemas.microsoft.com/office/2019/extlst" xmlns:r="http://schemas.openxmlformats.org/officeDocument/2006/relationships" xmlns:m="http://schemas.openxmlformats.org/officeDocument/2006/math" xmlns:v="urn:schemas-microsoft-com:vml" xmlns:wp14="http://schemas.microsoft.com/office/word/2010/wordprocessingDrawing" xmlns:wp="http://schemas.openxmlformats.org/drawingml/2006/wordprocessingDrawing" xmlns:w10="urn:schemas-microsoft-com:office:word" xmlns:w="http://schemas.openxmlformats.org/wordprocessingml/2006/main" xmlns:w14="http://schemas.microsoft.com/office/word/2010/wordml" xmlns:w15="http://schemas.microsoft.com/office/word/2012/wordml" xmlns:w16cex="http://schemas.microsoft.com/office/word/2018/wordml/cex" xmlns:w16cid="http://schemas.microsoft.com/office/word/2016/wordml/cid" xmlns:w16="http://schemas.microsoft.com/office/word/2018/wordml" xmlns:w16du="http://schemas.microsoft.com/office/word/2023/wordml/word16du" xmlns:w16sdtdh="http://schemas.microsoft.com/office/word/2020/wordml/sdtdatahash" xmlns:w16sdtfl="http://schemas.microsoft.com/office/word/2024/wordml/sdtformatlock" xmlns:w16se="http://schemas.microsoft.com/office/word/2015/wordml/symex" xmlns:wpg="http://schemas.microsoft.com/office/word/2010/wordprocessingGroup" xmlns:wpi="http://schemas.microsoft.com/office/word/2010/wordprocessingInk" xmlns:wne="http://schemas.microsoft.com/office/word/2006/wordml" xmlns:wps="http://schemas.microsoft.com/office/word/2010/wordprocessingShape" mc:Ignorable="w14 w15 w16se w16cid w16 w16cex w16sdtdh w16sdtfl w16du wp14">
   <w:p>
     <w:pPr>
-      <w:pStyle w:val="Encabezado"/>
+      <w:pStyle w:val="Header"/>
       <w:jc w:val="left"/>
       <w:rPr>
         <w:rFonts w:asciiTheme="majorHAnsi" w:hAnsiTheme="majorHAnsi" w:cstheme="majorHAnsi"/>
@@ -2588,7 +2721,7 @@
 <w:hdr xmlns:wpc="http://schemas.microsoft.com/office/word/2010/wordprocessingCanvas" xmlns:cx="http://schemas.microsoft.com/office/drawing/2014/chartex" xmlns:cx1="http://schemas.microsoft.com/office/drawing/2015/9/8/chartex" xmlns:cx2="http://schemas.microsoft.com/office/drawing/2015/10/21/chartex" xmlns:cx3="http://schemas.microsoft.com/office/drawing/2016/5/9/chartex" xmlns:cx4="http://schemas.microsoft.com/office/drawing/2016/5/10/chartex" xmlns:cx5="http://schemas.microsoft.com/office/drawing/2016/5/11/chartex" xmlns:cx6="http://schemas.microsoft.com/office/drawing/2016/5/12/chartex" xmlns:cx7="http://schemas.microsoft.com/office/drawing/2016/5/13/chartex" xmlns:cx8="http://schemas.microsoft.com/office/drawing/2016/5/14/chartex" xmlns:mc="http://schemas.openxmlformats.org/markup-compatibility/2006" xmlns:aink="http://schemas.microsoft.com/office/drawing/2016/ink" xmlns:am3d="http://schemas.microsoft.com/office/drawing/2017/model3d" xmlns:o="urn:schemas-microsoft-com:office:office" xmlns:oel="http://schemas.microsoft.com/office/2019/extlst" xmlns:r="http://schemas.openxmlformats.org/officeDocument/2006/relationships" xmlns:m="http://schemas.openxmlformats.org/officeDocument/2006/math" xmlns:v="urn:schemas-microsoft-com:vml" xmlns:wp14="http://schemas.microsoft.com/office/word/2010/wordprocessingDrawing" xmlns:wp="http://schemas.openxmlformats.org/drawingml/2006/wordprocessingDrawing" xmlns:w10="urn:schemas-microsoft-com:office:word" xmlns:w="http://schemas.openxmlformats.org/wordprocessingml/2006/main" xmlns:w14="http://schemas.microsoft.com/office/word/2010/wordml" xmlns:w15="http://schemas.microsoft.com/office/word/2012/wordml" xmlns:w16cex="http://schemas.microsoft.com/office/word/2018/wordml/cex" xmlns:w16cid="http://schemas.microsoft.com/office/word/2016/wordml/cid" xmlns:w16="http://schemas.microsoft.com/office/word/2018/wordml" xmlns:w16du="http://schemas.microsoft.com/office/word/2023/wordml/word16du" xmlns:w16sdtdh="http://schemas.microsoft.com/office/word/2020/wordml/sdtdatahash" xmlns:w16sdtfl="http://schemas.microsoft.com/office/word/2024/wordml/sdtformatlock" xmlns:w16se="http://schemas.microsoft.com/office/word/2015/wordml/symex" xmlns:wpg="http://schemas.microsoft.com/office/word/2010/wordprocessingGroup" xmlns:wpi="http://schemas.microsoft.com/office/word/2010/wordprocessingInk" xmlns:wne="http://schemas.microsoft.com/office/word/2006/wordml" xmlns:wps="http://schemas.microsoft.com/office/word/2010/wordprocessingShape" mc:Ignorable="w14 w15 w16se w16cid w16 w16cex w16sdtdh w16sdtfl w16du wp14">
   <w:p>
     <w:pPr>
-      <w:pStyle w:val="Encabezado"/>
+      <w:pStyle w:val="Header"/>
       <w:jc w:val="right"/>
     </w:pPr>
     <w:r>
@@ -5791,6 +5924,119 @@
     </w:lvl>
   </w:abstractNum>
   <w:abstractNum w:abstractNumId="30" w15:restartNumberingAfterBreak="0">
+    <w:nsid w:val="76C705E2"/>
+    <w:multiLevelType w:val="hybridMultilevel"/>
+    <w:tmpl w:val="BF581620"/>
+    <w:lvl w:ilvl="0" w:tplc="04090001">
+      <w:start w:val="1"/>
+      <w:numFmt w:val="bullet"/>
+      <w:lvlText w:val=""/>
+      <w:lvlJc w:val="left"/>
+      <w:pPr>
+        <w:ind w:left="720" w:hanging="360"/>
+      </w:pPr>
+      <w:rPr>
+        <w:rFonts w:ascii="Symbol" w:hAnsi="Symbol" w:hint="default"/>
+      </w:rPr>
+    </w:lvl>
+    <w:lvl w:ilvl="1" w:tplc="04090003" w:tentative="1">
+      <w:start w:val="1"/>
+      <w:numFmt w:val="bullet"/>
+      <w:lvlText w:val="o"/>
+      <w:lvlJc w:val="left"/>
+      <w:pPr>
+        <w:ind w:left="1440" w:hanging="360"/>
+      </w:pPr>
+      <w:rPr>
+        <w:rFonts w:ascii="Courier New" w:hAnsi="Courier New" w:cs="Courier New" w:hint="default"/>
+      </w:rPr>
+    </w:lvl>
+    <w:lvl w:ilvl="2" w:tplc="04090005" w:tentative="1">
+      <w:start w:val="1"/>
+      <w:numFmt w:val="bullet"/>
+      <w:lvlText w:val=""/>
+      <w:lvlJc w:val="left"/>
+      <w:pPr>
+        <w:ind w:left="2160" w:hanging="360"/>
+      </w:pPr>
+      <w:rPr>
+        <w:rFonts w:ascii="Wingdings" w:hAnsi="Wingdings" w:hint="default"/>
+      </w:rPr>
+    </w:lvl>
+    <w:lvl w:ilvl="3" w:tplc="04090001" w:tentative="1">
+      <w:start w:val="1"/>
+      <w:numFmt w:val="bullet"/>
+      <w:lvlText w:val=""/>
+      <w:lvlJc w:val="left"/>
+      <w:pPr>
+        <w:ind w:left="2880" w:hanging="360"/>
+      </w:pPr>
+      <w:rPr>
+        <w:rFonts w:ascii="Symbol" w:hAnsi="Symbol" w:hint="default"/>
+      </w:rPr>
+    </w:lvl>
+    <w:lvl w:ilvl="4" w:tplc="04090003" w:tentative="1">
+      <w:start w:val="1"/>
+      <w:numFmt w:val="bullet"/>
+      <w:lvlText w:val="o"/>
+      <w:lvlJc w:val="left"/>
+      <w:pPr>
+        <w:ind w:left="3600" w:hanging="360"/>
+      </w:pPr>
+      <w:rPr>
+        <w:rFonts w:ascii="Courier New" w:hAnsi="Courier New" w:cs="Courier New" w:hint="default"/>
+      </w:rPr>
+    </w:lvl>
+    <w:lvl w:ilvl="5" w:tplc="04090005" w:tentative="1">
+      <w:start w:val="1"/>
+      <w:numFmt w:val="bullet"/>
+      <w:lvlText w:val=""/>
+      <w:lvlJc w:val="left"/>
+      <w:pPr>
+        <w:ind w:left="4320" w:hanging="360"/>
+      </w:pPr>
+      <w:rPr>
+        <w:rFonts w:ascii="Wingdings" w:hAnsi="Wingdings" w:hint="default"/>
+      </w:rPr>
+    </w:lvl>
+    <w:lvl w:ilvl="6" w:tplc="04090001" w:tentative="1">
+      <w:start w:val="1"/>
+      <w:numFmt w:val="bullet"/>
+      <w:lvlText w:val=""/>
+      <w:lvlJc w:val="left"/>
+      <w:pPr>
+        <w:ind w:left="5040" w:hanging="360"/>
+      </w:pPr>
+      <w:rPr>
+        <w:rFonts w:ascii="Symbol" w:hAnsi="Symbol" w:hint="default"/>
+      </w:rPr>
+    </w:lvl>
+    <w:lvl w:ilvl="7" w:tplc="04090003" w:tentative="1">
+      <w:start w:val="1"/>
+      <w:numFmt w:val="bullet"/>
+      <w:lvlText w:val="o"/>
+      <w:lvlJc w:val="left"/>
+      <w:pPr>
+        <w:ind w:left="5760" w:hanging="360"/>
+      </w:pPr>
+      <w:rPr>
+        <w:rFonts w:ascii="Courier New" w:hAnsi="Courier New" w:cs="Courier New" w:hint="default"/>
+      </w:rPr>
+    </w:lvl>
+    <w:lvl w:ilvl="8" w:tplc="04090005" w:tentative="1">
+      <w:start w:val="1"/>
+      <w:numFmt w:val="bullet"/>
+      <w:lvlText w:val=""/>
+      <w:lvlJc w:val="left"/>
+      <w:pPr>
+        <w:ind w:left="6480" w:hanging="360"/>
+      </w:pPr>
+      <w:rPr>
+        <w:rFonts w:ascii="Wingdings" w:hAnsi="Wingdings" w:hint="default"/>
+      </w:rPr>
+    </w:lvl>
+  </w:abstractNum>
+  <w:abstractNum w:abstractNumId="31" w15:restartNumberingAfterBreak="0">
     <w:nsid w:val="784530C1"/>
     <w:multiLevelType w:val="hybridMultilevel"/>
     <w:tmpl w:val="3CF6FE18"/>
@@ -5903,7 +6149,7 @@
       </w:rPr>
     </w:lvl>
   </w:abstractNum>
-  <w:abstractNum w:abstractNumId="31" w15:restartNumberingAfterBreak="0">
+  <w:abstractNum w:abstractNumId="32" w15:restartNumberingAfterBreak="0">
     <w:nsid w:val="7C226B17"/>
     <w:multiLevelType w:val="hybridMultilevel"/>
     <w:tmpl w:val="316EBF58"/>
@@ -6016,7 +6262,7 @@
       </w:rPr>
     </w:lvl>
   </w:abstractNum>
-  <w:abstractNum w:abstractNumId="32" w15:restartNumberingAfterBreak="0">
+  <w:abstractNum w:abstractNumId="33" w15:restartNumberingAfterBreak="0">
     <w:nsid w:val="7C7324D3"/>
     <w:multiLevelType w:val="hybridMultilevel"/>
     <w:tmpl w:val="FBB601F2"/>
@@ -6139,7 +6385,7 @@
     <w:abstractNumId w:val="28"/>
   </w:num>
   <w:num w:numId="4" w16cid:durableId="263998001">
-    <w:abstractNumId w:val="30"/>
+    <w:abstractNumId w:val="31"/>
   </w:num>
   <w:num w:numId="5" w16cid:durableId="1694530711">
     <w:abstractNumId w:val="3"/>
@@ -6148,7 +6394,7 @@
     <w:abstractNumId w:val="27"/>
   </w:num>
   <w:num w:numId="7" w16cid:durableId="1510755812">
-    <w:abstractNumId w:val="32"/>
+    <w:abstractNumId w:val="33"/>
   </w:num>
   <w:num w:numId="8" w16cid:durableId="401295270">
     <w:abstractNumId w:val="29"/>
@@ -6190,7 +6436,7 @@
     <w:abstractNumId w:val="7"/>
   </w:num>
   <w:num w:numId="21" w16cid:durableId="1910534101">
-    <w:abstractNumId w:val="31"/>
+    <w:abstractNumId w:val="32"/>
   </w:num>
   <w:num w:numId="22" w16cid:durableId="124473379">
     <w:abstractNumId w:val="8"/>
@@ -6227,6 +6473,9 @@
   </w:num>
   <w:num w:numId="33" w16cid:durableId="1372653486">
     <w:abstractNumId w:val="21"/>
+  </w:num>
+  <w:num w:numId="34" w16cid:durableId="2022779372">
+    <w:abstractNumId w:val="30"/>
   </w:num>
   <w:numIdMacAtCleanup w:val="13"/>
 </w:numbering>
@@ -6642,11 +6891,11 @@
       <w:color w:val="000000"/>
     </w:rPr>
   </w:style>
-  <w:style w:type="paragraph" w:styleId="Ttulo1">
+  <w:style w:type="paragraph" w:styleId="Heading1">
     <w:name w:val="heading 1"/>
     <w:basedOn w:val="Normal"/>
     <w:next w:val="Normal"/>
-    <w:link w:val="Ttulo1Car"/>
+    <w:link w:val="Heading1Char"/>
     <w:uiPriority w:val="9"/>
     <w:qFormat/>
     <w:rsid w:val="00B60454"/>
@@ -6664,11 +6913,11 @@
       <w:szCs w:val="32"/>
     </w:rPr>
   </w:style>
-  <w:style w:type="paragraph" w:styleId="Ttulo2">
+  <w:style w:type="paragraph" w:styleId="Heading2">
     <w:name w:val="heading 2"/>
     <w:basedOn w:val="Normal"/>
     <w:next w:val="Normal"/>
-    <w:link w:val="Ttulo2Car"/>
+    <w:link w:val="Heading2Char"/>
     <w:uiPriority w:val="9"/>
     <w:unhideWhenUsed/>
     <w:qFormat/>
@@ -6687,11 +6936,11 @@
       <w:szCs w:val="26"/>
     </w:rPr>
   </w:style>
-  <w:style w:type="paragraph" w:styleId="Ttulo3">
+  <w:style w:type="paragraph" w:styleId="Heading3">
     <w:name w:val="heading 3"/>
     <w:basedOn w:val="Normal"/>
     <w:next w:val="Normal"/>
-    <w:link w:val="Ttulo3Car"/>
+    <w:link w:val="Heading3Char"/>
     <w:uiPriority w:val="9"/>
     <w:unhideWhenUsed/>
     <w:qFormat/>
@@ -6707,13 +6956,13 @@
       <w:color w:val="826600" w:themeColor="accent1" w:themeShade="7F"/>
     </w:rPr>
   </w:style>
-  <w:style w:type="character" w:default="1" w:styleId="Fuentedeprrafopredeter">
+  <w:style w:type="character" w:default="1" w:styleId="DefaultParagraphFont">
     <w:name w:val="Default Paragraph Font"/>
     <w:uiPriority w:val="1"/>
     <w:semiHidden/>
     <w:unhideWhenUsed/>
   </w:style>
-  <w:style w:type="table" w:default="1" w:styleId="Tablanormal">
+  <w:style w:type="table" w:default="1" w:styleId="TableNormal">
     <w:name w:val="Normal Table"/>
     <w:uiPriority w:val="99"/>
     <w:semiHidden/>
@@ -6728,16 +6977,16 @@
       </w:tblCellMar>
     </w:tblPr>
   </w:style>
-  <w:style w:type="numbering" w:default="1" w:styleId="Sinlista">
+  <w:style w:type="numbering" w:default="1" w:styleId="NoList">
     <w:name w:val="No List"/>
     <w:uiPriority w:val="99"/>
     <w:semiHidden/>
     <w:unhideWhenUsed/>
   </w:style>
-  <w:style w:type="paragraph" w:styleId="Encabezado">
+  <w:style w:type="paragraph" w:styleId="Header">
     <w:name w:val="header"/>
     <w:basedOn w:val="Normal"/>
-    <w:link w:val="EncabezadoCar"/>
+    <w:link w:val="HeaderChar"/>
     <w:uiPriority w:val="99"/>
     <w:unhideWhenUsed/>
     <w:rsid w:val="0043636D"/>
@@ -6749,10 +6998,10 @@
       <w:spacing w:after="0" w:line="240" w:lineRule="auto"/>
     </w:pPr>
   </w:style>
-  <w:style w:type="character" w:customStyle="1" w:styleId="EncabezadoCar">
-    <w:name w:val="Encabezado Car"/>
-    <w:basedOn w:val="Fuentedeprrafopredeter"/>
-    <w:link w:val="Encabezado"/>
+  <w:style w:type="character" w:customStyle="1" w:styleId="HeaderChar">
+    <w:name w:val="Header Char"/>
+    <w:basedOn w:val="DefaultParagraphFont"/>
+    <w:link w:val="Header"/>
     <w:uiPriority w:val="99"/>
     <w:rsid w:val="0043636D"/>
     <w:rPr>
@@ -6761,10 +7010,10 @@
       <w:sz w:val="22"/>
     </w:rPr>
   </w:style>
-  <w:style w:type="paragraph" w:styleId="Piedepgina">
+  <w:style w:type="paragraph" w:styleId="Footer">
     <w:name w:val="footer"/>
     <w:basedOn w:val="Normal"/>
-    <w:link w:val="PiedepginaCar"/>
+    <w:link w:val="FooterChar"/>
     <w:uiPriority w:val="99"/>
     <w:unhideWhenUsed/>
     <w:rsid w:val="0043636D"/>
@@ -6776,10 +7025,10 @@
       <w:spacing w:after="0" w:line="240" w:lineRule="auto"/>
     </w:pPr>
   </w:style>
-  <w:style w:type="character" w:customStyle="1" w:styleId="PiedepginaCar">
-    <w:name w:val="Pie de página Car"/>
-    <w:basedOn w:val="Fuentedeprrafopredeter"/>
-    <w:link w:val="Piedepgina"/>
+  <w:style w:type="character" w:customStyle="1" w:styleId="FooterChar">
+    <w:name w:val="Footer Char"/>
+    <w:basedOn w:val="DefaultParagraphFont"/>
+    <w:link w:val="Footer"/>
     <w:uiPriority w:val="99"/>
     <w:rsid w:val="0043636D"/>
     <w:rPr>
@@ -6788,10 +7037,10 @@
       <w:sz w:val="22"/>
     </w:rPr>
   </w:style>
-  <w:style w:type="character" w:customStyle="1" w:styleId="Ttulo1Car">
-    <w:name w:val="Título 1 Car"/>
-    <w:basedOn w:val="Fuentedeprrafopredeter"/>
-    <w:link w:val="Ttulo1"/>
+  <w:style w:type="character" w:customStyle="1" w:styleId="Heading1Char">
+    <w:name w:val="Heading 1 Char"/>
+    <w:basedOn w:val="DefaultParagraphFont"/>
+    <w:link w:val="Heading1"/>
     <w:uiPriority w:val="9"/>
     <w:rsid w:val="00B60454"/>
     <w:rPr>
@@ -6802,7 +7051,7 @@
       <w:szCs w:val="32"/>
     </w:rPr>
   </w:style>
-  <w:style w:type="paragraph" w:styleId="Prrafodelista">
+  <w:style w:type="paragraph" w:styleId="ListParagraph">
     <w:name w:val="List Paragraph"/>
     <w:basedOn w:val="Normal"/>
     <w:uiPriority w:val="34"/>
@@ -6813,9 +7062,9 @@
       <w:contextualSpacing/>
     </w:pPr>
   </w:style>
-  <w:style w:type="character" w:styleId="Hipervnculo">
+  <w:style w:type="character" w:styleId="Hyperlink">
     <w:name w:val="Hyperlink"/>
-    <w:basedOn w:val="Fuentedeprrafopredeter"/>
+    <w:basedOn w:val="DefaultParagraphFont"/>
     <w:uiPriority w:val="99"/>
     <w:unhideWhenUsed/>
     <w:rsid w:val="00886CAE"/>
@@ -6824,9 +7073,9 @@
       <w:u w:val="single"/>
     </w:rPr>
   </w:style>
-  <w:style w:type="character" w:styleId="Mencinsinresolver">
+  <w:style w:type="character" w:styleId="UnresolvedMention">
     <w:name w:val="Unresolved Mention"/>
-    <w:basedOn w:val="Fuentedeprrafopredeter"/>
+    <w:basedOn w:val="DefaultParagraphFont"/>
     <w:uiPriority w:val="99"/>
     <w:semiHidden/>
     <w:unhideWhenUsed/>
@@ -6836,9 +7085,9 @@
       <w:shd w:val="clear" w:color="auto" w:fill="E1DFDD"/>
     </w:rPr>
   </w:style>
-  <w:style w:type="character" w:styleId="Hipervnculovisitado">
+  <w:style w:type="character" w:styleId="FollowedHyperlink">
     <w:name w:val="FollowedHyperlink"/>
-    <w:basedOn w:val="Fuentedeprrafopredeter"/>
+    <w:basedOn w:val="DefaultParagraphFont"/>
     <w:uiPriority w:val="99"/>
     <w:semiHidden/>
     <w:unhideWhenUsed/>
@@ -6848,11 +7097,11 @@
       <w:u w:val="single"/>
     </w:rPr>
   </w:style>
-  <w:style w:type="paragraph" w:styleId="Ttulo">
+  <w:style w:type="paragraph" w:styleId="Title">
     <w:name w:val="Title"/>
     <w:basedOn w:val="Normal"/>
     <w:next w:val="Normal"/>
-    <w:link w:val="TtuloCar"/>
+    <w:link w:val="TitleChar"/>
     <w:uiPriority w:val="10"/>
     <w:qFormat/>
     <w:rsid w:val="00B942D0"/>
@@ -6869,10 +7118,10 @@
       <w:szCs w:val="56"/>
     </w:rPr>
   </w:style>
-  <w:style w:type="character" w:customStyle="1" w:styleId="TtuloCar">
-    <w:name w:val="Título Car"/>
-    <w:basedOn w:val="Fuentedeprrafopredeter"/>
-    <w:link w:val="Ttulo"/>
+  <w:style w:type="character" w:customStyle="1" w:styleId="TitleChar">
+    <w:name w:val="Title Char"/>
+    <w:basedOn w:val="DefaultParagraphFont"/>
+    <w:link w:val="Title"/>
     <w:uiPriority w:val="10"/>
     <w:rsid w:val="00B942D0"/>
     <w:rPr>
@@ -6883,10 +7132,10 @@
       <w:szCs w:val="56"/>
     </w:rPr>
   </w:style>
-  <w:style w:type="character" w:customStyle="1" w:styleId="Ttulo2Car">
-    <w:name w:val="Título 2 Car"/>
-    <w:basedOn w:val="Fuentedeprrafopredeter"/>
-    <w:link w:val="Ttulo2"/>
+  <w:style w:type="character" w:customStyle="1" w:styleId="Heading2Char">
+    <w:name w:val="Heading 2 Char"/>
+    <w:basedOn w:val="DefaultParagraphFont"/>
+    <w:link w:val="Heading2"/>
     <w:uiPriority w:val="9"/>
     <w:rsid w:val="00B60454"/>
     <w:rPr>
@@ -6897,7 +7146,7 @@
       <w:szCs w:val="26"/>
     </w:rPr>
   </w:style>
-  <w:style w:type="paragraph" w:styleId="Descripcin">
+  <w:style w:type="paragraph" w:styleId="Caption">
     <w:name w:val="caption"/>
     <w:basedOn w:val="Normal"/>
     <w:next w:val="Normal"/>
@@ -6916,9 +7165,9 @@
       <w:szCs w:val="18"/>
     </w:rPr>
   </w:style>
-  <w:style w:type="paragraph" w:styleId="TtuloTDC">
+  <w:style w:type="paragraph" w:styleId="TOCHeading">
     <w:name w:val="TOC Heading"/>
-    <w:basedOn w:val="Ttulo1"/>
+    <w:basedOn w:val="Heading1"/>
     <w:next w:val="Normal"/>
     <w:uiPriority w:val="39"/>
     <w:unhideWhenUsed/>
@@ -6935,7 +7184,7 @@
       <w14:ligatures w14:val="none"/>
     </w:rPr>
   </w:style>
-  <w:style w:type="paragraph" w:styleId="TDC1">
+  <w:style w:type="paragraph" w:styleId="TOC1">
     <w:name w:val="toc 1"/>
     <w:basedOn w:val="Normal"/>
     <w:next w:val="Normal"/>
@@ -6947,7 +7196,7 @@
       <w:spacing w:after="100"/>
     </w:pPr>
   </w:style>
-  <w:style w:type="paragraph" w:styleId="TDC2">
+  <w:style w:type="paragraph" w:styleId="TOC2">
     <w:name w:val="toc 2"/>
     <w:basedOn w:val="Normal"/>
     <w:next w:val="Normal"/>
@@ -6960,9 +7209,9 @@
       <w:ind w:left="220"/>
     </w:pPr>
   </w:style>
-  <w:style w:type="table" w:styleId="Tablaconcuadrcula">
+  <w:style w:type="table" w:styleId="TableGrid">
     <w:name w:val="Table Grid"/>
-    <w:basedOn w:val="Tablanormal"/>
+    <w:basedOn w:val="TableNormal"/>
     <w:uiPriority w:val="39"/>
     <w:rsid w:val="00E669DE"/>
     <w:pPr>
@@ -6979,9 +7228,9 @@
       </w:tblBorders>
     </w:tblPr>
   </w:style>
-  <w:style w:type="table" w:styleId="Tablaconcuadrcula4-nfasis6">
+  <w:style w:type="table" w:styleId="GridTable4-Accent6">
     <w:name w:val="Grid Table 4 Accent 6"/>
-    <w:basedOn w:val="Tablanormal"/>
+    <w:basedOn w:val="TableNormal"/>
     <w:uiPriority w:val="49"/>
     <w:rsid w:val="00E669DE"/>
     <w:pPr>
@@ -7055,9 +7304,9 @@
       </w:tcPr>
     </w:tblStylePr>
   </w:style>
-  <w:style w:type="table" w:styleId="Tabladelista3-nfasis3">
+  <w:style w:type="table" w:styleId="ListTable3-Accent3">
     <w:name w:val="List Table 3 Accent 3"/>
-    <w:basedOn w:val="Tablanormal"/>
+    <w:basedOn w:val="TableNormal"/>
     <w:uiPriority w:val="48"/>
     <w:rsid w:val="00AC07E0"/>
     <w:pPr>
@@ -7179,9 +7428,9 @@
       </w:tcPr>
     </w:tblStylePr>
   </w:style>
-  <w:style w:type="table" w:styleId="Tabladelista3-nfasis6">
+  <w:style w:type="table" w:styleId="ListTable3-Accent6">
     <w:name w:val="List Table 3 Accent 6"/>
-    <w:basedOn w:val="Tablanormal"/>
+    <w:basedOn w:val="TableNormal"/>
     <w:uiPriority w:val="48"/>
     <w:rsid w:val="00AC07E0"/>
     <w:pPr>
@@ -7303,9 +7552,9 @@
       </w:tcPr>
     </w:tblStylePr>
   </w:style>
-  <w:style w:type="table" w:styleId="Tabladelista4-nfasis3">
+  <w:style w:type="table" w:styleId="ListTable4-Accent3">
     <w:name w:val="List Table 4 Accent 3"/>
-    <w:basedOn w:val="Tablanormal"/>
+    <w:basedOn w:val="TableNormal"/>
     <w:uiPriority w:val="49"/>
     <w:rsid w:val="00AC07E0"/>
     <w:pPr>
@@ -7377,9 +7626,9 @@
       </w:tcPr>
     </w:tblStylePr>
   </w:style>
-  <w:style w:type="table" w:styleId="Tabladelista4-nfasis2">
+  <w:style w:type="table" w:styleId="ListTable4-Accent2">
     <w:name w:val="List Table 4 Accent 2"/>
-    <w:basedOn w:val="Tablanormal"/>
+    <w:basedOn w:val="TableNormal"/>
     <w:uiPriority w:val="49"/>
     <w:rsid w:val="00AC07E0"/>
     <w:pPr>
@@ -7451,9 +7700,9 @@
       </w:tcPr>
     </w:tblStylePr>
   </w:style>
-  <w:style w:type="table" w:styleId="Tabladelista4-nfasis5">
+  <w:style w:type="table" w:styleId="ListTable4-Accent5">
     <w:name w:val="List Table 4 Accent 5"/>
-    <w:basedOn w:val="Tablanormal"/>
+    <w:basedOn w:val="TableNormal"/>
     <w:uiPriority w:val="49"/>
     <w:rsid w:val="00AC07E0"/>
     <w:pPr>
@@ -7525,9 +7774,9 @@
       </w:tcPr>
     </w:tblStylePr>
   </w:style>
-  <w:style w:type="table" w:styleId="Tablaconcuadrcula5oscura-nfasis6">
+  <w:style w:type="table" w:styleId="GridTable5Dark-Accent6">
     <w:name w:val="Grid Table 5 Dark Accent 6"/>
-    <w:basedOn w:val="Tablanormal"/>
+    <w:basedOn w:val="TableNormal"/>
     <w:uiPriority w:val="50"/>
     <w:rsid w:val="00AC07E0"/>
     <w:pPr>
@@ -7631,9 +7880,9 @@
       </w:tcPr>
     </w:tblStylePr>
   </w:style>
-  <w:style w:type="character" w:styleId="Textodelmarcadordeposicin">
+  <w:style w:type="character" w:styleId="PlaceholderText">
     <w:name w:val="Placeholder Text"/>
-    <w:basedOn w:val="Fuentedeprrafopredeter"/>
+    <w:basedOn w:val="DefaultParagraphFont"/>
     <w:uiPriority w:val="99"/>
     <w:semiHidden/>
     <w:rsid w:val="00242D0F"/>
@@ -7659,12 +7908,12 @@
   </w:style>
   <w:style w:type="character" w:customStyle="1" w:styleId="url">
     <w:name w:val="url"/>
-    <w:basedOn w:val="Fuentedeprrafopredeter"/>
+    <w:basedOn w:val="DefaultParagraphFont"/>
     <w:rsid w:val="0065125D"/>
   </w:style>
-  <w:style w:type="character" w:styleId="Fuerte">
+  <w:style w:type="character" w:styleId="Strong">
     <w:name w:val="Strong"/>
-    <w:basedOn w:val="Fuentedeprrafopredeter"/>
+    <w:basedOn w:val="DefaultParagraphFont"/>
     <w:uiPriority w:val="22"/>
     <w:qFormat/>
     <w:rsid w:val="002364E4"/>
@@ -7673,10 +7922,10 @@
       <w:bCs/>
     </w:rPr>
   </w:style>
-  <w:style w:type="character" w:customStyle="1" w:styleId="Ttulo3Car">
-    <w:name w:val="Título 3 Car"/>
-    <w:basedOn w:val="Fuentedeprrafopredeter"/>
-    <w:link w:val="Ttulo3"/>
+  <w:style w:type="character" w:customStyle="1" w:styleId="Heading3Char">
+    <w:name w:val="Heading 3 Char"/>
+    <w:basedOn w:val="DefaultParagraphFont"/>
+    <w:link w:val="Heading3"/>
     <w:uiPriority w:val="9"/>
     <w:rsid w:val="00B60454"/>
     <w:rPr>
@@ -7684,9 +7933,9 @@
       <w:color w:val="826600" w:themeColor="accent1" w:themeShade="7F"/>
     </w:rPr>
   </w:style>
-  <w:style w:type="character" w:styleId="Refdecomentario">
+  <w:style w:type="character" w:styleId="CommentReference">
     <w:name w:val="annotation reference"/>
-    <w:basedOn w:val="Fuentedeprrafopredeter"/>
+    <w:basedOn w:val="DefaultParagraphFont"/>
     <w:uiPriority w:val="99"/>
     <w:semiHidden/>
     <w:unhideWhenUsed/>
@@ -7696,10 +7945,10 @@
       <w:szCs w:val="16"/>
     </w:rPr>
   </w:style>
-  <w:style w:type="paragraph" w:styleId="Textocomentario">
+  <w:style w:type="paragraph" w:styleId="CommentText">
     <w:name w:val="annotation text"/>
     <w:basedOn w:val="Normal"/>
-    <w:link w:val="TextocomentarioCar"/>
+    <w:link w:val="CommentTextChar"/>
     <w:uiPriority w:val="99"/>
     <w:unhideWhenUsed/>
     <w:rsid w:val="00880E38"/>
@@ -7711,10 +7960,10 @@
       <w:szCs w:val="20"/>
     </w:rPr>
   </w:style>
-  <w:style w:type="character" w:customStyle="1" w:styleId="TextocomentarioCar">
-    <w:name w:val="Texto comentario Car"/>
-    <w:basedOn w:val="Fuentedeprrafopredeter"/>
-    <w:link w:val="Textocomentario"/>
+  <w:style w:type="character" w:customStyle="1" w:styleId="CommentTextChar">
+    <w:name w:val="Comment Text Char"/>
+    <w:basedOn w:val="DefaultParagraphFont"/>
+    <w:link w:val="CommentText"/>
     <w:uiPriority w:val="99"/>
     <w:rsid w:val="00880E38"/>
     <w:rPr>
@@ -7724,11 +7973,11 @@
       <w:szCs w:val="20"/>
     </w:rPr>
   </w:style>
-  <w:style w:type="paragraph" w:styleId="Asuntodelcomentario">
+  <w:style w:type="paragraph" w:styleId="CommentSubject">
     <w:name w:val="annotation subject"/>
-    <w:basedOn w:val="Textocomentario"/>
-    <w:next w:val="Textocomentario"/>
-    <w:link w:val="AsuntodelcomentarioCar"/>
+    <w:basedOn w:val="CommentText"/>
+    <w:next w:val="CommentText"/>
+    <w:link w:val="CommentSubjectChar"/>
     <w:uiPriority w:val="99"/>
     <w:semiHidden/>
     <w:unhideWhenUsed/>
@@ -7738,10 +7987,10 @@
       <w:bCs/>
     </w:rPr>
   </w:style>
-  <w:style w:type="character" w:customStyle="1" w:styleId="AsuntodelcomentarioCar">
-    <w:name w:val="Asunto del comentario Car"/>
-    <w:basedOn w:val="TextocomentarioCar"/>
-    <w:link w:val="Asuntodelcomentario"/>
+  <w:style w:type="character" w:customStyle="1" w:styleId="CommentSubjectChar">
+    <w:name w:val="Comment Subject Char"/>
+    <w:basedOn w:val="CommentTextChar"/>
+    <w:link w:val="CommentSubject"/>
     <w:uiPriority w:val="99"/>
     <w:semiHidden/>
     <w:rsid w:val="00880E38"/>
@@ -7754,9 +8003,9 @@
       <w:szCs w:val="20"/>
     </w:rPr>
   </w:style>
-  <w:style w:type="character" w:styleId="nfasis">
+  <w:style w:type="character" w:styleId="Emphasis">
     <w:name w:val="Emphasis"/>
-    <w:basedOn w:val="Fuentedeprrafopredeter"/>
+    <w:basedOn w:val="DefaultParagraphFont"/>
     <w:uiPriority w:val="20"/>
     <w:qFormat/>
     <w:rsid w:val="00123D67"/>

</xml_diff>